<commit_message>
Director Command CEO subtractive redesign + FL/GA plumbing + I-region cleanup
</commit_message>
<xml_diff>
--- a/docs/AHM_Authorization_Training_Guide_v2.docx
+++ b/docs/AHM_Authorization_Training_Guide_v2.docx
@@ -2,6 +2,14 @@
 <file path=word/document.xml><?xml version="1.0" encoding="utf-8"?>
 <w:document xmlns:wpc="http://schemas.microsoft.com/office/word/2010/wordprocessingCanvas" xmlns:mc="http://schemas.openxmlformats.org/markup-compatibility/2006" xmlns:o="urn:schemas-microsoft-com:office:office" xmlns:r="http://schemas.openxmlformats.org/officeDocument/2006/relationships" xmlns:m="http://schemas.openxmlformats.org/officeDocument/2006/math" xmlns:v="urn:schemas-microsoft-com:vml" xmlns:wp14="http://schemas.microsoft.com/office/word/2010/wordprocessingDrawing" xmlns:wp="http://schemas.openxmlformats.org/drawingml/2006/wordprocessingDrawing" xmlns:w10="urn:schemas-microsoft-com:office:word" xmlns:w="http://schemas.openxmlformats.org/wordprocessingml/2006/main" xmlns:w14="http://schemas.microsoft.com/office/word/2010/wordml" xmlns:w15="http://schemas.microsoft.com/office/word/2012/wordml" xmlns:wpg="http://schemas.microsoft.com/office/word/2010/wordprocessingGroup" xmlns:wpi="http://schemas.microsoft.com/office/word/2010/wordprocessingInk" xmlns:wne="http://schemas.microsoft.com/office/word/2006/wordml" xmlns:wps="http://schemas.microsoft.com/office/word/2010/wordprocessingShape" xmlns:cx="http://schemas.microsoft.com/office/drawing/2014/chartex" xmlns:cx1="http://schemas.microsoft.com/office/drawing/2015/9/8/chartex" xmlns:cx2="http://schemas.microsoft.com/office/drawing/2015/10/21/chartex" xmlns:cx3="http://schemas.microsoft.com/office/drawing/2016/5/9/chartex" xmlns:cx4="http://schemas.microsoft.com/office/drawing/2016/5/10/chartex" xmlns:cx5="http://schemas.microsoft.com/office/drawing/2016/5/11/chartex" xmlns:cx6="http://schemas.microsoft.com/office/drawing/2016/5/12/chartex" xmlns:cx7="http://schemas.microsoft.com/office/drawing/2016/5/13/chartex" xmlns:cx8="http://schemas.microsoft.com/office/drawing/2016/5/14/chartex" xmlns:aink="http://schemas.microsoft.com/office/drawing/2016/ink" xmlns:am3d="http://schemas.microsoft.com/office/drawing/2017/model3d" xmlns:w16cex="http://schemas.microsoft.com/office/word/2018/wordml/cex" xmlns:w16cid="http://schemas.microsoft.com/office/word/2016/wordml/cid" xmlns:w16="http://schemas.microsoft.com/office/word/2018/wordml" xmlns:w16sdtdh="http://schemas.microsoft.com/office/word/2020/wordml/sdtdatahash" xmlns:w16se="http://schemas.microsoft.com/office/word/2015/wordml/symex" mc:Ignorable="w14 w15 wp14">
   <w:body>
+    <w:p>
+      <w:r>
+        <w:rPr>
+          <w:i/>
+        </w:rPr>
+        <w:t>Naming note (2026-06-01): "EdemaCare" is the public-facing brand as of June 1, 2026. "AxiomHealth Management" / "AHM" remains the legal entity name. This guide is preserved under its original filename to keep links stable; the content below has been updated to use the EdemaCare brand where user-visible. EdemaCare is a service of AxiomHealth Management LLC.</w:t>
+      </w:r>
+    </w:p>
     <w:p>
       <w:pPr>
         <w:spacing w:after="80"/>
@@ -15,7 +23,7 @@
           <w:sz w:val="28"/>
           <w:szCs w:val="28"/>
         </w:rPr>
-        <w:t xml:space="preserve">EdemaCare / AxiomHealth</w:t>
+        <w:t>EdemaCare / EdemaCare</w:t>
       </w:r>
     </w:p>
     <w:p>
@@ -8218,6 +8226,8 @@
     <w:sectPr>
       <w:headerReference w:type="default" r:id="rId7"/>
       <w:footerReference w:type="default" r:id="rId8"/>
+      <w:headerReference w:type="first" r:id="rId10"/>
+      <w:footerReference w:type="first" r:id="rId11"/>
       <w:pgSz w:w="12240" w:h="15840" w:orient="portrait"/>
       <w:pgMar w:top="1440" w:right="1440" w:bottom="1440" w:left="1440" w:header="708" w:footer="708" w:gutter="0"/>
       <w:pgNumType/>
@@ -8280,7 +8290,7 @@
         <w:sz w:val="18"/>
         <w:szCs w:val="18"/>
       </w:rPr>
-      <w:t xml:space="preserve">EdemaCare / AxiomHealth   ·   May 28, 2026   ·   Page </w:t>
+      <w:t xml:space="preserve">EdemaCare   ·   May 28, 2026   ·   Page </w:t>
     </w:r>
     <w:r>
       <w:rPr>
@@ -8288,11 +8298,17 @@
         <w:sz w:val="18"/>
         <w:szCs w:val="18"/>
       </w:rPr>
-      <w:fldChar w:fldCharType="begin"/>
-      <w:instrText xml:space="preserve">PAGE</w:instrText>
-      <w:fldChar w:fldCharType="separate"/>
-      <w:fldChar w:fldCharType="end"/>
     </w:r>
+  </w:p>
+</w:ftr>
+</file>
+
+<file path=word/footer2.xml><?xml version="1.0" encoding="utf-8"?>
+<w:ftr xmlns:m="http://schemas.openxmlformats.org/officeDocument/2006/math" xmlns:mc="http://schemas.openxmlformats.org/markup-compatibility/2006" xmlns:mo="http://schemas.microsoft.com/office/mac/office/2008/main" xmlns:mv="urn:schemas-microsoft-com:mac:vml" xmlns:o="urn:schemas-microsoft-com:office:office" xmlns:r="http://schemas.openxmlformats.org/officeDocument/2006/relationships" xmlns:v="urn:schemas-microsoft-com:vml" xmlns:w10="urn:schemas-microsoft-com:office:word" xmlns:w14="http://schemas.microsoft.com/office/word/2010/wordml" xmlns:w="http://schemas.openxmlformats.org/wordprocessingml/2006/main" xmlns:wne="http://schemas.microsoft.com/office/word/2006/wordml" xmlns:wp14="http://schemas.microsoft.com/office/word/2010/wordprocessingDrawing" xmlns:wp="http://schemas.openxmlformats.org/drawingml/2006/wordprocessingDrawing" xmlns:wpc="http://schemas.microsoft.com/office/word/2010/wordprocessingCanvas" xmlns:wpg="http://schemas.microsoft.com/office/word/2010/wordprocessingGroup" xmlns:wpi="http://schemas.microsoft.com/office/word/2010/wordprocessingInk" xmlns:wps="http://schemas.microsoft.com/office/word/2010/wordprocessingShape" mc:Ignorable="w14 wp14">
+  <w:p>
+    <w:pPr>
+      <w:pStyle w:val="Footer"/>
+    </w:pPr>
   </w:p>
 </w:ftr>
 </file>
@@ -8346,8 +8362,18 @@
         <w:sz w:val="18"/>
         <w:szCs w:val="18"/>
       </w:rPr>
-      <w:t xml:space="preserve">AHM Authorization Training Guide v2.0</w:t>
+      <w:t>EdemaCare Authorization Training Guide v2.0</w:t>
     </w:r>
+  </w:p>
+</w:hdr>
+</file>
+
+<file path=word/header2.xml><?xml version="1.0" encoding="utf-8"?>
+<w:hdr xmlns:m="http://schemas.openxmlformats.org/officeDocument/2006/math" xmlns:mc="http://schemas.openxmlformats.org/markup-compatibility/2006" xmlns:mo="http://schemas.microsoft.com/office/mac/office/2008/main" xmlns:mv="urn:schemas-microsoft-com:mac:vml" xmlns:o="urn:schemas-microsoft-com:office:office" xmlns:r="http://schemas.openxmlformats.org/officeDocument/2006/relationships" xmlns:v="urn:schemas-microsoft-com:vml" xmlns:w10="urn:schemas-microsoft-com:office:word" xmlns:w14="http://schemas.microsoft.com/office/word/2010/wordml" xmlns:w="http://schemas.openxmlformats.org/wordprocessingml/2006/main" xmlns:wne="http://schemas.microsoft.com/office/word/2006/wordml" xmlns:wp14="http://schemas.microsoft.com/office/word/2010/wordprocessingDrawing" xmlns:wp="http://schemas.openxmlformats.org/drawingml/2006/wordprocessingDrawing" xmlns:wpc="http://schemas.microsoft.com/office/word/2010/wordprocessingCanvas" xmlns:wpg="http://schemas.microsoft.com/office/word/2010/wordprocessingGroup" xmlns:wpi="http://schemas.microsoft.com/office/word/2010/wordprocessingInk" xmlns:wps="http://schemas.microsoft.com/office/word/2010/wordprocessingShape" mc:Ignorable="w14 wp14">
+  <w:p>
+    <w:pPr>
+      <w:pStyle w:val="Header"/>
+    </w:pPr>
   </w:p>
 </w:hdr>
 </file>

</xml_diff>